<commit_message>
Add GitHub link to KT5 report
</commit_message>
<xml_diff>
--- a/artifacts/kt5_report.docx
+++ b/artifacts/kt5_report.docx
@@ -18,6 +18,11 @@
     <w:p>
       <w:r>
         <w:t xml:space="preserve">Трек: П - прикладной, разработка программной системы.</w:t>
+      </w:r>
+    </w:p>
+    <w:p>
+      <w:r>
+        <w:t xml:space="preserve">Репозиторий с прототипом: https://github.com/FazexIam/library-olap-kt5</w:t>
       </w:r>
     </w:p>
     <w:p>

</xml_diff>